<commit_message>
Corrección errores algunos nombres. Hecho sprint 4
</commit_message>
<xml_diff>
--- a/Memoria/MemoriaSprint3.docx
+++ b/Memoria/MemoriaSprint3.docx
@@ -179,34 +179,14 @@
                   <w:szCs w:val="28"/>
                 </w:rPr>
               </w:pPr>
-              <w:proofErr w:type="spellStart"/>
               <w:r>
                 <w:rPr>
                   <w:color w:val="4472C4" w:themeColor="accent1"/>
                   <w:sz w:val="28"/>
                   <w:szCs w:val="28"/>
                 </w:rPr>
-                <w:t>Grid</w:t>
+                <w:t>Grid &amp; Growler</w:t>
               </w:r>
-              <w:proofErr w:type="spellEnd"/>
-              <w:r>
-                <w:rPr>
-                  <w:color w:val="4472C4" w:themeColor="accent1"/>
-                  <w:sz w:val="28"/>
-                  <w:szCs w:val="28"/>
-                </w:rPr>
-                <w:t xml:space="preserve"> &amp; </w:t>
-              </w:r>
-              <w:proofErr w:type="spellStart"/>
-              <w:r>
-                <w:rPr>
-                  <w:color w:val="4472C4" w:themeColor="accent1"/>
-                  <w:sz w:val="28"/>
-                  <w:szCs w:val="28"/>
-                </w:rPr>
-                <w:t>Growler</w:t>
-              </w:r>
-              <w:proofErr w:type="spellEnd"/>
             </w:p>
           </w:sdtContent>
         </w:sdt>
@@ -1258,34 +1238,14 @@
         </w:rPr>
         <w:t xml:space="preserve">Para crear la página web del restaurante </w:t>
       </w:r>
-      <w:proofErr w:type="spellStart"/>
       <w:r>
         <w:rPr>
           <w:b/>
           <w:bCs/>
           <w:sz w:val="24"/>
         </w:rPr>
-        <w:t>Grid</w:t>
-      </w:r>
-      <w:proofErr w:type="spellEnd"/>
-      <w:r>
-        <w:rPr>
-          <w:b/>
-          <w:bCs/>
-          <w:sz w:val="24"/>
-        </w:rPr>
-        <w:t xml:space="preserve"> &amp; </w:t>
-      </w:r>
-      <w:proofErr w:type="spellStart"/>
-      <w:r>
-        <w:rPr>
-          <w:b/>
-          <w:bCs/>
-          <w:sz w:val="24"/>
-        </w:rPr>
-        <w:t>Growler</w:t>
-      </w:r>
-      <w:proofErr w:type="spellEnd"/>
+        <w:t>Grid &amp; Growler</w:t>
+      </w:r>
       <w:r>
         <w:rPr>
           <w:sz w:val="24"/>
@@ -1310,7 +1270,6 @@
         </w:rPr>
         <w:t>Usuarios (</w:t>
       </w:r>
-      <w:proofErr w:type="spellStart"/>
       <w:r>
         <w:rPr>
           <w:sz w:val="24"/>
@@ -1318,60 +1277,17 @@
         </w:rPr>
         <w:t>dni</w:t>
       </w:r>
-      <w:proofErr w:type="spellEnd"/>
-      <w:r>
-        <w:rPr>
-          <w:sz w:val="24"/>
-        </w:rPr>
-        <w:t xml:space="preserve">, nombre, apellidos, </w:t>
-      </w:r>
-      <w:proofErr w:type="spellStart"/>
-      <w:r>
-        <w:rPr>
-          <w:sz w:val="24"/>
-        </w:rPr>
-        <w:t>telefono</w:t>
-      </w:r>
-      <w:proofErr w:type="spellEnd"/>
-      <w:r>
-        <w:rPr>
-          <w:sz w:val="24"/>
-        </w:rPr>
-        <w:t xml:space="preserve">, </w:t>
-      </w:r>
-      <w:proofErr w:type="spellStart"/>
-      <w:r>
-        <w:rPr>
-          <w:sz w:val="24"/>
-        </w:rPr>
-        <w:t>direccion</w:t>
-      </w:r>
-      <w:proofErr w:type="spellEnd"/>
-      <w:r>
-        <w:rPr>
-          <w:sz w:val="24"/>
-        </w:rPr>
-        <w:t>, email,</w:t>
-      </w:r>
-      <w:r>
-        <w:rPr>
-          <w:sz w:val="24"/>
-        </w:rPr>
-        <w:t xml:space="preserve"> </w:t>
-      </w:r>
-      <w:proofErr w:type="spellStart"/>
-      <w:r>
-        <w:rPr>
-          <w:sz w:val="24"/>
-        </w:rPr>
-        <w:t>passwd</w:t>
-      </w:r>
-      <w:proofErr w:type="spellEnd"/>
-      <w:r>
-        <w:rPr>
-          <w:sz w:val="24"/>
-        </w:rPr>
-        <w:t>,</w:t>
+      <w:r>
+        <w:rPr>
+          <w:sz w:val="24"/>
+        </w:rPr>
+        <w:t>, nombre, apellidos, telefono, direccion, email,</w:t>
+      </w:r>
+      <w:r>
+        <w:rPr>
+          <w:sz w:val="24"/>
+        </w:rPr>
+        <w:t xml:space="preserve"> passwd,</w:t>
       </w:r>
       <w:r>
         <w:rPr>
@@ -1410,7 +1326,6 @@
         </w:rPr>
         <w:t xml:space="preserve">, </w:t>
       </w:r>
-      <w:proofErr w:type="spellStart"/>
       <w:r>
         <w:rPr>
           <w:sz w:val="24"/>
@@ -1418,26 +1333,11 @@
         </w:rPr>
         <w:t>idm</w:t>
       </w:r>
-      <w:proofErr w:type="spellEnd"/>
-      <w:r>
-        <w:rPr>
-          <w:sz w:val="24"/>
-        </w:rPr>
-        <w:t xml:space="preserve">, </w:t>
-      </w:r>
-      <w:proofErr w:type="spellStart"/>
-      <w:r>
-        <w:rPr>
-          <w:sz w:val="24"/>
-        </w:rPr>
-        <w:t>fechaHora</w:t>
-      </w:r>
-      <w:proofErr w:type="spellEnd"/>
-      <w:r>
-        <w:rPr>
-          <w:sz w:val="24"/>
-        </w:rPr>
-        <w:t>, comensales</w:t>
+      <w:r>
+        <w:rPr>
+          <w:sz w:val="24"/>
+        </w:rPr>
+        <w:t>, fechaHora, comensales</w:t>
       </w:r>
       <w:r>
         <w:rPr>
@@ -1469,7 +1369,6 @@
         </w:rPr>
         <w:t>Productos (</w:t>
       </w:r>
-      <w:proofErr w:type="spellStart"/>
       <w:r>
         <w:rPr>
           <w:sz w:val="24"/>
@@ -1477,7 +1376,6 @@
         </w:rPr>
         <w:t>idprod</w:t>
       </w:r>
-      <w:proofErr w:type="spellEnd"/>
       <w:r>
         <w:rPr>
           <w:sz w:val="24"/>
@@ -1488,16 +1386,8 @@
         <w:rPr>
           <w:sz w:val="24"/>
         </w:rPr>
-        <w:t xml:space="preserve">, </w:t>
-      </w:r>
-      <w:proofErr w:type="spellStart"/>
-      <w:r>
-        <w:rPr>
-          <w:sz w:val="24"/>
-        </w:rPr>
-        <w:t>estado_cat</w:t>
-      </w:r>
-      <w:proofErr w:type="spellEnd"/>
+        <w:t>, estado_cat</w:t>
+      </w:r>
       <w:r>
         <w:rPr>
           <w:sz w:val="24"/>
@@ -1522,7 +1412,6 @@
         </w:rPr>
         <w:t>Mesas (</w:t>
       </w:r>
-      <w:proofErr w:type="spellStart"/>
       <w:r>
         <w:rPr>
           <w:sz w:val="24"/>
@@ -1530,7 +1419,6 @@
         </w:rPr>
         <w:t>idm</w:t>
       </w:r>
-      <w:proofErr w:type="spellEnd"/>
       <w:r>
         <w:rPr>
           <w:sz w:val="24"/>
@@ -1555,7 +1443,6 @@
         </w:rPr>
         <w:t>Pedidos (</w:t>
       </w:r>
-      <w:proofErr w:type="spellStart"/>
       <w:r>
         <w:rPr>
           <w:sz w:val="24"/>
@@ -1563,7 +1450,6 @@
         </w:rPr>
         <w:t>idped</w:t>
       </w:r>
-      <w:proofErr w:type="spellEnd"/>
       <w:r>
         <w:rPr>
           <w:sz w:val="24"/>
@@ -1574,41 +1460,13 @@
         <w:rPr>
           <w:sz w:val="24"/>
         </w:rPr>
-        <w:t xml:space="preserve"> </w:t>
-      </w:r>
-      <w:proofErr w:type="spellStart"/>
-      <w:r>
-        <w:rPr>
-          <w:sz w:val="24"/>
-        </w:rPr>
-        <w:t>fechaHora</w:t>
-      </w:r>
-      <w:proofErr w:type="spellEnd"/>
-      <w:r>
-        <w:rPr>
-          <w:sz w:val="24"/>
-        </w:rPr>
-        <w:t>,</w:t>
-      </w:r>
-      <w:r>
-        <w:rPr>
-          <w:sz w:val="24"/>
-        </w:rPr>
-        <w:t xml:space="preserve"> usuario, estado, </w:t>
-      </w:r>
-      <w:proofErr w:type="spellStart"/>
-      <w:r>
-        <w:rPr>
-          <w:sz w:val="24"/>
-        </w:rPr>
-        <w:t>idm</w:t>
-      </w:r>
-      <w:proofErr w:type="spellEnd"/>
-      <w:r>
-        <w:rPr>
-          <w:sz w:val="24"/>
-        </w:rPr>
-        <w:t>)</w:t>
+        <w:t xml:space="preserve"> fechaHora,</w:t>
+      </w:r>
+      <w:r>
+        <w:rPr>
+          <w:sz w:val="24"/>
+        </w:rPr>
+        <w:t xml:space="preserve"> usuario, estado, idm)</w:t>
       </w:r>
     </w:p>
     <w:p>
@@ -1634,7 +1492,6 @@
         </w:rPr>
         <w:t xml:space="preserve"> (</w:t>
       </w:r>
-      <w:proofErr w:type="spellStart"/>
       <w:r>
         <w:rPr>
           <w:sz w:val="24"/>
@@ -1642,7 +1499,6 @@
         </w:rPr>
         <w:t>idc</w:t>
       </w:r>
-      <w:proofErr w:type="spellEnd"/>
       <w:r>
         <w:rPr>
           <w:sz w:val="24"/>
@@ -1673,76 +1529,55 @@
           <w:sz w:val="24"/>
         </w:rPr>
       </w:pPr>
-      <w:proofErr w:type="spellStart"/>
       <w:r>
         <w:rPr>
           <w:sz w:val="24"/>
         </w:rPr>
         <w:t>Pedido_producto</w:t>
       </w:r>
-      <w:proofErr w:type="spellEnd"/>
       <w:r>
         <w:rPr>
           <w:sz w:val="24"/>
         </w:rPr>
         <w:t xml:space="preserve"> (</w:t>
       </w:r>
-      <w:proofErr w:type="spellStart"/>
-      <w:r>
-        <w:rPr>
-          <w:sz w:val="24"/>
-        </w:rPr>
-        <w:t>id_linea</w:t>
-      </w:r>
-      <w:proofErr w:type="spellEnd"/>
+      <w:r>
+        <w:rPr>
+          <w:sz w:val="24"/>
+        </w:rPr>
+        <w:t xml:space="preserve">id_linea, </w:t>
+      </w:r>
+      <w:r>
+        <w:rPr>
+          <w:sz w:val="24"/>
+          <w:u w:val="single"/>
+        </w:rPr>
+        <w:t>idped</w:t>
+      </w:r>
       <w:r>
         <w:rPr>
           <w:sz w:val="24"/>
         </w:rPr>
         <w:t xml:space="preserve">, </w:t>
       </w:r>
-      <w:proofErr w:type="spellStart"/>
       <w:r>
         <w:rPr>
           <w:sz w:val="24"/>
           <w:u w:val="single"/>
         </w:rPr>
-        <w:t>idped</w:t>
-      </w:r>
-      <w:proofErr w:type="spellEnd"/>
+        <w:t>idprod</w:t>
+      </w:r>
       <w:r>
         <w:rPr>
           <w:sz w:val="24"/>
         </w:rPr>
         <w:t xml:space="preserve">, </w:t>
       </w:r>
-      <w:proofErr w:type="spellStart"/>
-      <w:r>
-        <w:rPr>
-          <w:sz w:val="24"/>
-          <w:u w:val="single"/>
-        </w:rPr>
-        <w:t>idprod</w:t>
-      </w:r>
-      <w:proofErr w:type="spellEnd"/>
-      <w:r>
-        <w:rPr>
-          <w:sz w:val="24"/>
-        </w:rPr>
-        <w:t xml:space="preserve">, </w:t>
-      </w:r>
-      <w:r>
-        <w:rPr>
-          <w:sz w:val="24"/>
-        </w:rPr>
-        <w:t xml:space="preserve">comentario, </w:t>
-      </w:r>
-      <w:proofErr w:type="spellStart"/>
-      <w:r>
-        <w:rPr>
-          <w:sz w:val="24"/>
-        </w:rPr>
-        <w:t>estado</w:t>
+      <w:r>
+        <w:rPr>
+          <w:sz w:val="24"/>
+        </w:rPr>
+        <w:t>comentario, estado</w:t>
       </w:r>
       <w:r>
         <w:rPr>
@@ -1750,7 +1585,6 @@
         </w:rPr>
         <w:t>g</w:t>
       </w:r>
-      <w:proofErr w:type="spellEnd"/>
       <w:r>
         <w:rPr>
           <w:sz w:val="24"/>
@@ -3227,35 +3061,7 @@
         <w:rPr>
           <w:sz w:val="24"/>
         </w:rPr>
-        <w:t xml:space="preserve">También he tenido algún problema para generar la búsqueda de productos del cliente, ya que tengo el menú separado por categorías, y cuando buscaba un producto me seguían apareciendo todas las categorías. Al final generé el código de búsqueda fuera del código que generaba las categorías, separados por un </w:t>
-      </w:r>
-      <w:proofErr w:type="spellStart"/>
-      <w:r>
-        <w:rPr>
-          <w:sz w:val="24"/>
-        </w:rPr>
-        <w:t>if</w:t>
-      </w:r>
-      <w:proofErr w:type="spellEnd"/>
-      <w:r>
-        <w:rPr>
-          <w:sz w:val="24"/>
-        </w:rPr>
-        <w:t>/</w:t>
-      </w:r>
-      <w:proofErr w:type="spellStart"/>
-      <w:r>
-        <w:rPr>
-          <w:sz w:val="24"/>
-        </w:rPr>
-        <w:t>else</w:t>
-      </w:r>
-      <w:proofErr w:type="spellEnd"/>
-      <w:r>
-        <w:rPr>
-          <w:sz w:val="24"/>
-        </w:rPr>
-        <w:t xml:space="preserve">. </w:t>
+        <w:t xml:space="preserve">También he tenido algún problema para generar la búsqueda de productos del cliente, ya que tengo el menú separado por categorías, y cuando buscaba un producto me seguían apareciendo todas las categorías. Al final generé el código de búsqueda fuera del código que generaba las categorías, separados por un if/else. </w:t>
       </w:r>
     </w:p>
     <w:p>
@@ -5103,6 +4909,7 @@
   </w:compat>
   <w:rsids>
     <w:rsidRoot w:val="00DB76CF"/>
+    <w:rsid w:val="00007911"/>
     <w:rsid w:val="001152F9"/>
     <w:rsid w:val="003E10BE"/>
     <w:rsid w:val="00602831"/>

</xml_diff>